<commit_message>
Logo assombri et simplification des tableaux (Petra, Djena)
- Logo du Lambermont assombri et sature (l'original reste dans
  assets/logo_lambermont_original.png).
- Tableaux : suppression des noms de coachs entre parentheses et des prix
  normaux du physique et des collectifs, laisses a completer.
- Suppression de la note "Prix terrain : 525 EUR/heure" sur les deux
  documents.

Co-Authored-By: Claude Opus 5 <noreply@anthropic.com>
Claude-Session: https://claude.ai/code/session_016C6F2i84bo1mZfVdC3FYrw
</commit_message>
<xml_diff>
--- a/Programme_Djena.docx
+++ b/Programme_Djena.docx
@@ -156,7 +156,7 @@
               <w:spacing w:after="40" w:before="40"/>
             </w:pPr>
             <w:r>
-              <w:t>1h30 de physique (avec Loïc)</w:t>
+              <w:t>1h30 de physique</w:t>
             </w:r>
           </w:p>
         </w:tc>
@@ -169,7 +169,7 @@
               <w:spacing w:after="40" w:before="40"/>
             </w:pPr>
             <w:r>
-              <w:t>330</w:t>
+              <w:t>………</w:t>
             </w:r>
           </w:p>
         </w:tc>
@@ -210,7 +210,7 @@
               <w:spacing w:after="40" w:before="40"/>
             </w:pPr>
             <w:r>
-              <w:t>220</w:t>
+              <w:t>………</w:t>
             </w:r>
           </w:p>
         </w:tc>
@@ -238,7 +238,7 @@
               <w:spacing w:after="40" w:before="40"/>
             </w:pPr>
             <w:r>
-              <w:t>Collectif 1h30 (avec Taha)</w:t>
+              <w:t>Collectif 1h30</w:t>
             </w:r>
           </w:p>
         </w:tc>
@@ -251,7 +251,7 @@
               <w:spacing w:after="40" w:before="40"/>
             </w:pPr>
             <w:r>
-              <w:t>800</w:t>
+              <w:t>………</w:t>
             </w:r>
           </w:p>
         </w:tc>
@@ -339,7 +339,7 @@
               <w:rPr>
                 <w:b/>
               </w:rPr>
-              <w:t>2125</w:t>
+              <w:t>………</w:t>
             </w:r>
           </w:p>
         </w:tc>
@@ -361,17 +361,6 @@
         </w:tc>
       </w:tr>
     </w:tbl>
-    <w:p>
-      <w:pPr>
-        <w:spacing w:before="120"/>
-      </w:pPr>
-      <w:r>
-        <w:rPr>
-          <w:sz w:val="20"/>
-        </w:rPr>
-        <w:t>Prix terrain : 525 €/heure.</w:t>
-      </w:r>
-    </w:p>
     <w:sectPr>
       <w:headerReference w:type="default" r:id="rId9"/>
       <w:pgSz w:w="12240" w:h="15840"/>

</xml_diff>

<commit_message>
Logo place dans le corps du document et script de generation partage
Le logo etait dans la zone d'en-tete de Word, qui s'affiche estompee tant
qu'on edite le corps du document : il paraissait delave. Il est desormais
en haut du corps, comme dans la facture, donc a plein contraste.

Ajout de scripts/generer_programme.py qui produit les deux programmes a
partir d'une meme mise en page.

Co-Authored-By: Claude Opus 5 <noreply@anthropic.com>
Claude-Session: https://claude.ai/code/session_016C6F2i84bo1mZfVdC3FYrw
</commit_message>
<xml_diff>
--- a/Programme_Djena.docx
+++ b/Programme_Djena.docx
@@ -4,10 +4,67 @@
   <w:body>
     <w:p>
       <w:pPr>
+        <w:spacing w:after="40"/>
+        <w:jc w:val="center"/>
+      </w:pPr>
+      <w:r>
+        <w:drawing>
+          <wp:inline xmlns:a="http://schemas.openxmlformats.org/drawingml/2006/main" xmlns:pic="http://schemas.openxmlformats.org/drawingml/2006/picture">
+            <wp:extent cx="2880000" cy="818777"/>
+            <wp:docPr id="1" name="Picture 1"/>
+            <wp:cNvGraphicFramePr>
+              <a:graphicFrameLocks noChangeAspect="1"/>
+            </wp:cNvGraphicFramePr>
+            <a:graphic>
+              <a:graphicData uri="http://schemas.openxmlformats.org/drawingml/2006/picture">
+                <pic:pic>
+                  <pic:nvPicPr>
+                    <pic:cNvPr id="0" name="logo_lambermont.png"/>
+                    <pic:cNvPicPr/>
+                  </pic:nvPicPr>
+                  <pic:blipFill>
+                    <a:blip r:embed="rId9"/>
+                    <a:stretch>
+                      <a:fillRect/>
+                    </a:stretch>
+                  </pic:blipFill>
+                  <pic:spPr>
+                    <a:xfrm>
+                      <a:off x="0" y="0"/>
+                      <a:ext cx="2880000" cy="818777"/>
+                    </a:xfrm>
+                    <a:prstGeom prst="rect"/>
+                  </pic:spPr>
+                </pic:pic>
+              </a:graphicData>
+            </a:graphic>
+          </wp:inline>
+        </w:drawing>
+      </w:r>
+    </w:p>
+    <w:p>
+      <w:pPr>
+        <w:pBdr>
+          <w:bottom w:val="single" w:sz="12" w:space="4" w:color="55621E"/>
+        </w:pBdr>
+        <w:spacing w:after="80"/>
+        <w:jc w:val="center"/>
+      </w:pPr>
+      <w:r>
+        <w:rPr>
+          <w:b/>
+          <w:color w:val="262626"/>
+          <w:sz w:val="18"/>
+        </w:rPr>
+        <w:t>École de tennis du Lambermont</w:t>
+      </w:r>
+    </w:p>
+    <w:p>
+      <w:pPr>
         <w:pBdr>
           <w:bottom w:val="single" w:sz="6" w:space="4" w:color="000000"/>
         </w:pBdr>
-        <w:spacing w:before="240" w:after="280"/>
+        <w:spacing w:before="360" w:after="280"/>
       </w:pPr>
       <w:r>
         <w:rPr>
@@ -62,7 +119,7 @@
           </w:tcPr>
           <w:p>
             <w:pPr>
-              <w:spacing w:after="40" w:before="40"/>
+              <w:spacing w:before="40" w:after="40"/>
             </w:pPr>
             <w:r>
               <w:rPr>
@@ -78,7 +135,7 @@
           </w:tcPr>
           <w:p>
             <w:pPr>
-              <w:spacing w:after="40" w:before="40"/>
+              <w:spacing w:before="40" w:after="40"/>
             </w:pPr>
             <w:r>
               <w:rPr>
@@ -94,7 +151,7 @@
           </w:tcPr>
           <w:p>
             <w:pPr>
-              <w:spacing w:after="40" w:before="40"/>
+              <w:spacing w:before="40" w:after="40"/>
             </w:pPr>
             <w:r>
               <w:rPr>
@@ -112,7 +169,7 @@
           </w:tcPr>
           <w:p>
             <w:pPr>
-              <w:spacing w:after="40" w:before="40"/>
+              <w:spacing w:before="40" w:after="40"/>
             </w:pPr>
             <w:r>
               <w:t>1h de terrain (privé)</w:t>
@@ -125,7 +182,7 @@
           </w:tcPr>
           <w:p>
             <w:pPr>
-              <w:spacing w:after="40" w:before="40"/>
+              <w:spacing w:before="40" w:after="40"/>
             </w:pPr>
             <w:r>
               <w:t>525</w:t>
@@ -138,7 +195,7 @@
           </w:tcPr>
           <w:p>
             <w:pPr>
-              <w:spacing w:after="40" w:before="40"/>
+              <w:spacing w:before="40" w:after="40"/>
             </w:pPr>
             <w:r>
               <w:t>Gratuit</w:t>
@@ -153,7 +210,7 @@
           </w:tcPr>
           <w:p>
             <w:pPr>
-              <w:spacing w:after="40" w:before="40"/>
+              <w:spacing w:before="40" w:after="40"/>
             </w:pPr>
             <w:r>
               <w:t>1h30 de physique</w:t>
@@ -166,7 +223,7 @@
           </w:tcPr>
           <w:p>
             <w:pPr>
-              <w:spacing w:after="40" w:before="40"/>
+              <w:spacing w:before="40" w:after="40"/>
             </w:pPr>
             <w:r>
               <w:t>………</w:t>
@@ -179,7 +236,7 @@
           </w:tcPr>
           <w:p>
             <w:pPr>
-              <w:spacing w:after="40" w:before="40"/>
+              <w:spacing w:before="40" w:after="40"/>
             </w:pPr>
             <w:r>
               <w:t>………</w:t>
@@ -194,7 +251,7 @@
           </w:tcPr>
           <w:p>
             <w:pPr>
-              <w:spacing w:after="40" w:before="40"/>
+              <w:spacing w:before="40" w:after="40"/>
             </w:pPr>
             <w:r>
               <w:t>1h de physique sur terrain</w:t>
@@ -207,7 +264,7 @@
           </w:tcPr>
           <w:p>
             <w:pPr>
-              <w:spacing w:after="40" w:before="40"/>
+              <w:spacing w:before="40" w:after="40"/>
             </w:pPr>
             <w:r>
               <w:t>………</w:t>
@@ -220,7 +277,7 @@
           </w:tcPr>
           <w:p>
             <w:pPr>
-              <w:spacing w:after="40" w:before="40"/>
+              <w:spacing w:before="40" w:after="40"/>
             </w:pPr>
             <w:r>
               <w:t>Gratuit</w:t>
@@ -235,7 +292,7 @@
           </w:tcPr>
           <w:p>
             <w:pPr>
-              <w:spacing w:after="40" w:before="40"/>
+              <w:spacing w:before="40" w:after="40"/>
             </w:pPr>
             <w:r>
               <w:t>Collectif 1h30</w:t>
@@ -248,7 +305,7 @@
           </w:tcPr>
           <w:p>
             <w:pPr>
-              <w:spacing w:after="40" w:before="40"/>
+              <w:spacing w:before="40" w:after="40"/>
             </w:pPr>
             <w:r>
               <w:t>………</w:t>
@@ -261,7 +318,7 @@
           </w:tcPr>
           <w:p>
             <w:pPr>
-              <w:spacing w:after="40" w:before="40"/>
+              <w:spacing w:before="40" w:after="40"/>
             </w:pPr>
             <w:r>
               <w:t>………</w:t>
@@ -276,7 +333,7 @@
           </w:tcPr>
           <w:p>
             <w:pPr>
-              <w:spacing w:after="40" w:before="40"/>
+              <w:spacing w:before="40" w:after="40"/>
             </w:pPr>
             <w:r>
               <w:t>League Cup</w:t>
@@ -289,7 +346,7 @@
           </w:tcPr>
           <w:p>
             <w:pPr>
-              <w:spacing w:after="40" w:before="40"/>
+              <w:spacing w:before="40" w:after="40"/>
             </w:pPr>
             <w:r>
               <w:t>250</w:t>
@@ -302,7 +359,7 @@
           </w:tcPr>
           <w:p>
             <w:pPr>
-              <w:spacing w:after="40" w:before="40"/>
+              <w:spacing w:before="40" w:after="40"/>
             </w:pPr>
             <w:r>
               <w:t>………</w:t>
@@ -317,7 +374,7 @@
           </w:tcPr>
           <w:p>
             <w:pPr>
-              <w:spacing w:after="40" w:before="40"/>
+              <w:spacing w:before="40" w:after="40"/>
             </w:pPr>
             <w:r>
               <w:rPr>
@@ -333,7 +390,7 @@
           </w:tcPr>
           <w:p>
             <w:pPr>
-              <w:spacing w:after="40" w:before="40"/>
+              <w:spacing w:before="40" w:after="40"/>
             </w:pPr>
             <w:r>
               <w:rPr>
@@ -349,7 +406,7 @@
           </w:tcPr>
           <w:p>
             <w:pPr>
-              <w:spacing w:after="40" w:before="40"/>
+              <w:spacing w:before="40" w:after="40"/>
             </w:pPr>
             <w:r>
               <w:rPr>
@@ -362,7 +419,6 @@
       </w:tr>
     </w:tbl>
     <w:sectPr>
-      <w:headerReference w:type="default" r:id="rId9"/>
       <w:pgSz w:w="12240" w:h="15840"/>
       <w:pgMar w:top="850" w:right="1417" w:bottom="1134" w:left="1417" w:header="720" w:footer="720" w:gutter="0"/>
       <w:cols w:space="720"/>
@@ -370,68 +426,6 @@
     </w:sectPr>
   </w:body>
 </w:document>
-</file>
-
-<file path=word/header1.xml><?xml version="1.0" encoding="utf-8"?>
-<w:hdr xmlns:m="http://schemas.openxmlformats.org/officeDocument/2006/math" xmlns:mc="http://schemas.openxmlformats.org/markup-compatibility/2006" xmlns:mo="http://schemas.microsoft.com/office/mac/office/2008/main" xmlns:mv="urn:schemas-microsoft-com:mac:vml" xmlns:o="urn:schemas-microsoft-com:office:office" xmlns:r="http://schemas.openxmlformats.org/officeDocument/2006/relationships" xmlns:v="urn:schemas-microsoft-com:vml" xmlns:w10="urn:schemas-microsoft-com:office:word" xmlns:w14="http://schemas.microsoft.com/office/word/2010/wordml" xmlns:w="http://schemas.openxmlformats.org/wordprocessingml/2006/main" xmlns:wne="http://schemas.microsoft.com/office/word/2006/wordml" xmlns:wp14="http://schemas.microsoft.com/office/word/2010/wordprocessingDrawing" xmlns:wp="http://schemas.openxmlformats.org/drawingml/2006/wordprocessingDrawing" xmlns:wpc="http://schemas.microsoft.com/office/word/2010/wordprocessingCanvas" xmlns:wpg="http://schemas.microsoft.com/office/word/2010/wordprocessingGroup" xmlns:wpi="http://schemas.microsoft.com/office/word/2010/wordprocessingInk" xmlns:wps="http://schemas.microsoft.com/office/word/2010/wordprocessingShape" mc:Ignorable="w14 wp14">
-  <w:p>
-    <w:pPr>
-      <w:pStyle w:val="Header"/>
-      <w:jc w:val="center"/>
-    </w:pPr>
-    <w:r>
-      <w:drawing>
-        <wp:inline xmlns:a="http://schemas.openxmlformats.org/drawingml/2006/main" xmlns:pic="http://schemas.openxmlformats.org/drawingml/2006/picture">
-          <wp:extent cx="2880000" cy="818777"/>
-          <wp:docPr id="1" name="Picture 1"/>
-          <wp:cNvGraphicFramePr>
-            <a:graphicFrameLocks noChangeAspect="1"/>
-          </wp:cNvGraphicFramePr>
-          <a:graphic>
-            <a:graphicData uri="http://schemas.openxmlformats.org/drawingml/2006/picture">
-              <pic:pic>
-                <pic:nvPicPr>
-                  <pic:cNvPr id="0" name="logo_lambermont.png"/>
-                  <pic:cNvPicPr/>
-                </pic:nvPicPr>
-                <pic:blipFill>
-                  <a:blip r:embed="rId1"/>
-                  <a:stretch>
-                    <a:fillRect/>
-                  </a:stretch>
-                </pic:blipFill>
-                <pic:spPr>
-                  <a:xfrm>
-                    <a:off x="0" y="0"/>
-                    <a:ext cx="2880000" cy="818777"/>
-                  </a:xfrm>
-                  <a:prstGeom prst="rect"/>
-                </pic:spPr>
-              </pic:pic>
-            </a:graphicData>
-          </a:graphic>
-        </wp:inline>
-      </w:drawing>
-    </w:r>
-  </w:p>
-  <w:p>
-    <w:pPr>
-      <w:pBdr>
-        <w:bottom w:val="single" w:sz="12" w:space="4" w:color="55621E"/>
-      </w:pBdr>
-      <w:spacing w:after="40"/>
-      <w:jc w:val="center"/>
-    </w:pPr>
-    <w:r>
-      <w:rPr>
-        <w:b/>
-        <w:color w:val="262626"/>
-        <w:sz w:val="18"/>
-      </w:rPr>
-      <w:t>École de tennis du Lambermont</w:t>
-    </w:r>
-  </w:p>
-</w:hdr>
 </file>
 
 <file path=word/numbering.xml><?xml version="1.0" encoding="utf-8"?>

</xml_diff>